<commit_message>
Sync to current metadataBuildingBlocks (review revision 2026-06)
Regenerate cdifCoreStructuredSchema.json; document schema:contentSize on
DataDownload (implementation guide .md + .docx); convert numeric
schema:contentSize to strings in examples.

Co-Authored-By: Claude Opus 4.7 (1M context) <noreply@anthropic.com>
</commit_message>
<xml_diff>
--- a/CDIFCoreImplementationGuide.docx
+++ b/CDIFCoreImplementationGuide.docx
@@ -58,7 +58,7 @@
       </w:r>
     </w:p>
     <w:bookmarkEnd w:id="22"/>
-    <w:bookmarkStart w:id="163" w:name="model"/>
+    <w:bookmarkStart w:id="164" w:name="model"/>
     <w:p>
       <w:pPr>
         <w:pStyle w:val="Heading1"/>
@@ -2488,7 +2488,7 @@
     <w:bookmarkEnd w:id="53"/>
     <w:bookmarkEnd w:id="54"/>
     <w:bookmarkEnd w:id="55"/>
-    <w:bookmarkStart w:id="133" w:name="other-classes-used-for-cdif-core"/>
+    <w:bookmarkStart w:id="134" w:name="other-classes-used-for-cdif-core"/>
     <w:p>
       <w:pPr>
         <w:pStyle w:val="Heading2"/>
@@ -2497,7 +2497,7 @@
         <w:t xml:space="preserve">Other Classes used for CDIF Core</w:t>
       </w:r>
     </w:p>
-    <w:bookmarkStart w:id="65" w:name="sec-datadownload"/>
+    <w:bookmarkStart w:id="66" w:name="sec-datadownload"/>
     <w:p>
       <w:pPr>
         <w:pStyle w:val="Heading3"/>
@@ -2943,7 +2943,106 @@
       </w:r>
     </w:p>
     <w:bookmarkEnd w:id="61"/>
-    <w:bookmarkStart w:id="62" w:name="spdxchecksum"/>
+    <w:bookmarkStart w:id="62" w:name="contentsize"/>
+    <w:p>
+      <w:pPr>
+        <w:pStyle w:val="Heading4"/>
+      </w:pPr>
+      <w:r>
+        <w:rPr>
+          <w:bCs/>
+          <w:b/>
+          <w:u w:val="single"/>
+        </w:rPr>
+        <w:t xml:space="preserve">contentSize</w:t>
+      </w:r>
+    </w:p>
+    <w:p>
+      <w:pPr>
+        <w:pStyle w:val="FirstParagraph"/>
+      </w:pPr>
+      <w:r>
+        <w:rPr>
+          <w:bCs/>
+          <w:b/>
+        </w:rPr>
+        <w:t xml:space="preserve">Cardinality:</w:t>
+      </w:r>
+      <w:r>
+        <w:t xml:space="preserve"> </w:t>
+      </w:r>
+      <w:r>
+        <w:t xml:space="preserve">Optional</w:t>
+      </w:r>
+    </w:p>
+    <w:p>
+      <w:pPr>
+        <w:pStyle w:val="BodyText"/>
+      </w:pPr>
+      <w:r>
+        <w:rPr>
+          <w:bCs/>
+          <w:b/>
+        </w:rPr>
+        <w:t xml:space="preserve">Content:</w:t>
+      </w:r>
+      <w:r>
+        <w:t xml:space="preserve"> </w:t>
+      </w:r>
+      <w:r>
+        <w:t xml:space="preserve">string</w:t>
+      </w:r>
+    </w:p>
+    <w:p>
+      <w:pPr>
+        <w:pStyle w:val="BodyText"/>
+      </w:pPr>
+      <w:r>
+        <w:rPr>
+          <w:bCs/>
+          <w:b/>
+        </w:rPr>
+        <w:t xml:space="preserve">Description:</w:t>
+      </w:r>
+      <w:r>
+        <w:t xml:space="preserve"> </w:t>
+      </w:r>
+      <w:r>
+        <w:t xml:space="preserve">File size of this distribution, expressed as a string – e.g. </w:t>
+      </w:r>
+      <w:r>
+        <w:t xml:space="preserve">‘</w:t>
+      </w:r>
+      <w:r>
+        <w:t xml:space="preserve">2.5 MB</w:t>
+      </w:r>
+      <w:r>
+        <w:t xml:space="preserve">’</w:t>
+      </w:r>
+      <w:r>
+        <w:t xml:space="preserve"> </w:t>
+      </w:r>
+      <w:r>
+        <w:t xml:space="preserve">or a byte count like</w:t>
+      </w:r>
+      <w:r>
+        <w:t xml:space="preserve"> </w:t>
+      </w:r>
+      <w:r>
+        <w:t xml:space="preserve">‘</w:t>
+      </w:r>
+      <w:r>
+        <w:t xml:space="preserve">144143</w:t>
+      </w:r>
+      <w:r>
+        <w:t xml:space="preserve">’</w:t>
+      </w:r>
+      <w:r>
+        <w:t xml:space="preserve">. Per schema.org/contentSize.</w:t>
+      </w:r>
+    </w:p>
+    <w:bookmarkEnd w:id="62"/>
+    <w:bookmarkStart w:id="63" w:name="spdxchecksum"/>
     <w:p>
       <w:pPr>
         <w:pStyle w:val="Heading4"/>
@@ -3034,8 +3133,8 @@
         <w:t xml:space="preserve">of the described file to enable testing for file modification. Algorithm used is specified by spdx:algorithm property.</w:t>
       </w:r>
     </w:p>
-    <w:bookmarkEnd w:id="62"/>
-    <w:bookmarkStart w:id="63" w:name="dctermsconformsto"/>
+    <w:bookmarkEnd w:id="63"/>
+    <w:bookmarkStart w:id="64" w:name="dctermsconformsto"/>
     <w:p>
       <w:pPr>
         <w:pStyle w:val="Heading4"/>
@@ -3108,8 +3207,8 @@
         <w:t xml:space="preserve">An identifier for a specification that the distribution conforms to. Recommended to enable machine-actionable data access. The target download might conform to more that one profile specification.</w:t>
       </w:r>
     </w:p>
-    <w:bookmarkEnd w:id="63"/>
-    <w:bookmarkStart w:id="64" w:name="provider-1"/>
+    <w:bookmarkEnd w:id="64"/>
+    <w:bookmarkStart w:id="65" w:name="provider-1"/>
     <w:p>
       <w:pPr>
         <w:pStyle w:val="Heading4"/>
@@ -3210,9 +3309,9 @@
         <w:t xml:space="preserve">The agent responsible for acces to the described resource. Use contact for this agent to report access problems.</w:t>
       </w:r>
     </w:p>
-    <w:bookmarkEnd w:id="64"/>
     <w:bookmarkEnd w:id="65"/>
-    <w:bookmarkStart w:id="70" w:name="sec-webapi"/>
+    <w:bookmarkEnd w:id="66"/>
+    <w:bookmarkStart w:id="71" w:name="sec-webapi"/>
     <w:p>
       <w:pPr>
         <w:pStyle w:val="Heading3"/>
@@ -3244,7 +3343,7 @@
         <w:t xml:space="preserve">) specify query parameters to filter the source data, request particular output formats or other options offered by the interface.</w:t>
       </w:r>
     </w:p>
-    <w:bookmarkStart w:id="66" w:name="servicetype"/>
+    <w:bookmarkStart w:id="67" w:name="servicetype"/>
     <w:p>
       <w:pPr>
         <w:pStyle w:val="Heading4"/>
@@ -3323,8 +3422,8 @@
         <w:t xml:space="preserve">Specify the kind of service. Ideally this should be a resolvable identifier. Currently there is no widely adopted registry for serviceType identifiers. Services might be defined at different levels of granularity, and classifications might focus on function, data formats, thematic content, security, or other aspects of the service definition. For interoperability, there must be an external arrangement between data providers and consumers on the strings that will be used to specify service types.</w:t>
       </w:r>
     </w:p>
-    <w:bookmarkEnd w:id="66"/>
-    <w:bookmarkStart w:id="67" w:name="termsofservice"/>
+    <w:bookmarkEnd w:id="67"/>
+    <w:bookmarkStart w:id="68" w:name="termsofservice"/>
     <w:p>
       <w:pPr>
         <w:pStyle w:val="Heading4"/>
@@ -3403,8 +3502,8 @@
         <w:t xml:space="preserve">Description of access privileges required to use the API, e.g. registration, licensing, payments. Note that access constraints applying to all distributions of the resource should be specified in the access constraints for the resource description as a whole.</w:t>
       </w:r>
     </w:p>
-    <w:bookmarkEnd w:id="67"/>
-    <w:bookmarkStart w:id="68" w:name="documentation"/>
+    <w:bookmarkEnd w:id="68"/>
+    <w:bookmarkStart w:id="69" w:name="documentation"/>
     <w:p>
       <w:pPr>
         <w:pStyle w:val="Heading4"/>
@@ -3483,8 +3582,8 @@
         <w:t xml:space="preserve">A machine-actionable description of a service instance. Examples include OpenAPI documents, OGC Capabilities documents. Software designed to utilise a particular service type will typically include functionality to parse such a description document and engage with the service endpoint. If such a document is available for the service instance providing the resource distribution, it should be included in the distribution metadata.</w:t>
       </w:r>
     </w:p>
-    <w:bookmarkEnd w:id="68"/>
-    <w:bookmarkStart w:id="69" w:name="potentialaction"/>
+    <w:bookmarkEnd w:id="69"/>
+    <w:bookmarkStart w:id="70" w:name="potentialaction"/>
     <w:p>
       <w:pPr>
         <w:pStyle w:val="Heading4"/>
@@ -3571,9 +3670,9 @@
         <w:t xml:space="preserve">Description of the operations offered by the interface.</w:t>
       </w:r>
     </w:p>
-    <w:bookmarkEnd w:id="69"/>
     <w:bookmarkEnd w:id="70"/>
-    <w:bookmarkStart w:id="77" w:name="sec-action"/>
+    <w:bookmarkEnd w:id="71"/>
+    <w:bookmarkStart w:id="78" w:name="sec-action"/>
     <w:p>
       <w:pPr>
         <w:pStyle w:val="Heading3"/>
@@ -3582,7 +3681,7 @@
         <w:t xml:space="preserve">Action</w:t>
       </w:r>
     </w:p>
-    <w:bookmarkStart w:id="71" w:name="type-2"/>
+    <w:bookmarkStart w:id="72" w:name="type-2"/>
     <w:p>
       <w:pPr>
         <w:pStyle w:val="Heading4"/>
@@ -3665,8 +3764,8 @@
         <w:t xml:space="preserve">, but any of these schema.org actions will validate: {Action, AssessAction, ConsumeAction, ControlAction, CreateAction, DeleteAction, FindAction, InteractAction, MoveAction, PlayAction, SearchAction, TransferAction, UpdateAction}</w:t>
       </w:r>
     </w:p>
-    <w:bookmarkEnd w:id="71"/>
-    <w:bookmarkStart w:id="72" w:name="name-2"/>
+    <w:bookmarkEnd w:id="72"/>
+    <w:bookmarkStart w:id="73" w:name="name-2"/>
     <w:p>
       <w:pPr>
         <w:pStyle w:val="Heading4"/>
@@ -3734,8 +3833,8 @@
         <w:t xml:space="preserve">text label for the action</w:t>
       </w:r>
     </w:p>
-    <w:bookmarkEnd w:id="72"/>
-    <w:bookmarkStart w:id="73" w:name="target"/>
+    <w:bookmarkEnd w:id="73"/>
+    <w:bookmarkStart w:id="74" w:name="target"/>
     <w:p>
       <w:pPr>
         <w:pStyle w:val="Heading4"/>
@@ -3808,8 +3907,8 @@
         <w:t xml:space="preserve">specifies the request target location and request syntax</w:t>
       </w:r>
     </w:p>
-    <w:bookmarkEnd w:id="73"/>
-    <w:bookmarkStart w:id="74" w:name="result"/>
+    <w:bookmarkEnd w:id="74"/>
+    <w:bookmarkStart w:id="75" w:name="result"/>
     <w:p>
       <w:pPr>
         <w:pStyle w:val="Heading4"/>
@@ -3882,8 +3981,8 @@
         <w:t xml:space="preserve">specifies the serialization scheme (encoding format, information model) for expected representation of the data</w:t>
       </w:r>
     </w:p>
-    <w:bookmarkEnd w:id="74"/>
-    <w:bookmarkStart w:id="75" w:name="object"/>
+    <w:bookmarkEnd w:id="75"/>
+    <w:bookmarkStart w:id="76" w:name="object"/>
     <w:p>
       <w:pPr>
         <w:pStyle w:val="Heading4"/>
@@ -3951,8 +4050,8 @@
         <w:t xml:space="preserve">Specifies the resource that is the object (input) of the action. The value is an open ended class (Thing can be anything…) for general description of Actions. When schema:Action (or a subclass) is used to descibe operations for a WebAPI distribution (the normal CDIF usage), the object is implicitly the resource that is the subject of the containing metadata record, so this property would be superfluous.</w:t>
       </w:r>
     </w:p>
-    <w:bookmarkEnd w:id="75"/>
-    <w:bookmarkStart w:id="76" w:name="query-input"/>
+    <w:bookmarkEnd w:id="76"/>
+    <w:bookmarkStart w:id="77" w:name="query-input"/>
     <w:p>
       <w:pPr>
         <w:pStyle w:val="Heading4"/>
@@ -4025,9 +4124,9 @@
         <w:t xml:space="preserve">set of explanations of the parameters in the URL template for the target EntryPoint.</w:t>
       </w:r>
     </w:p>
-    <w:bookmarkEnd w:id="76"/>
     <w:bookmarkEnd w:id="77"/>
-    <w:bookmarkStart w:id="87" w:name="sec-person"/>
+    <w:bookmarkEnd w:id="78"/>
+    <w:bookmarkStart w:id="88" w:name="sec-person"/>
     <w:p>
       <w:pPr>
         <w:pStyle w:val="Heading3"/>
@@ -4044,7 +4143,7 @@
         <w:t xml:space="preserve">Object representing a person.</w:t>
       </w:r>
     </w:p>
-    <w:bookmarkStart w:id="78" w:name="id-2"/>
+    <w:bookmarkStart w:id="79" w:name="id-2"/>
     <w:p>
       <w:pPr>
         <w:pStyle w:val="Heading4"/>
@@ -4112,8 +4211,8 @@
         <w:t xml:space="preserve">Identifier for this graph node. Useful to reference this Person using object references if they appear more that once in the metadata record.</w:t>
       </w:r>
     </w:p>
-    <w:bookmarkEnd w:id="78"/>
-    <w:bookmarkStart w:id="79" w:name="type-3"/>
+    <w:bookmarkEnd w:id="79"/>
+    <w:bookmarkStart w:id="80" w:name="type-3"/>
     <w:p>
       <w:pPr>
         <w:pStyle w:val="Heading4"/>
@@ -4196,8 +4295,8 @@
         <w:t xml:space="preserve">rdf:type for this JSON-LD object.</w:t>
       </w:r>
     </w:p>
-    <w:bookmarkEnd w:id="79"/>
-    <w:bookmarkStart w:id="80" w:name="name-3"/>
+    <w:bookmarkEnd w:id="80"/>
+    <w:bookmarkStart w:id="81" w:name="name-3"/>
     <w:p>
       <w:pPr>
         <w:pStyle w:val="Heading4"/>
@@ -4283,8 +4382,8 @@
         <w:t xml:space="preserve">format.</w:t>
       </w:r>
     </w:p>
-    <w:bookmarkEnd w:id="80"/>
-    <w:bookmarkStart w:id="81" w:name="identifier-1"/>
+    <w:bookmarkEnd w:id="81"/>
+    <w:bookmarkStart w:id="82" w:name="identifier-1"/>
     <w:p>
       <w:pPr>
         <w:pStyle w:val="Heading4"/>
@@ -4345,8 +4444,8 @@
         </w:r>
       </w:hyperlink>
     </w:p>
-    <w:bookmarkEnd w:id="81"/>
-    <w:bookmarkStart w:id="82" w:name="description-2"/>
+    <w:bookmarkEnd w:id="82"/>
+    <w:bookmarkStart w:id="83" w:name="description-2"/>
     <w:p>
       <w:pPr>
         <w:pStyle w:val="Heading4"/>
@@ -4414,8 +4513,8 @@
         <w:t xml:space="preserve">Other useful information about the person.</w:t>
       </w:r>
     </w:p>
-    <w:bookmarkEnd w:id="82"/>
-    <w:bookmarkStart w:id="83" w:name="alternatename"/>
+    <w:bookmarkEnd w:id="83"/>
+    <w:bookmarkStart w:id="84" w:name="alternatename"/>
     <w:p>
       <w:pPr>
         <w:pStyle w:val="Heading4"/>
@@ -4483,8 +4582,8 @@
         <w:t xml:space="preserve">Other names by which the person is known.</w:t>
       </w:r>
     </w:p>
-    <w:bookmarkEnd w:id="83"/>
-    <w:bookmarkStart w:id="84" w:name="affiliation"/>
+    <w:bookmarkEnd w:id="84"/>
+    <w:bookmarkStart w:id="85" w:name="affiliation"/>
     <w:p>
       <w:pPr>
         <w:pStyle w:val="Heading4"/>
@@ -4557,8 +4656,8 @@
         <w:t xml:space="preserve">Organization that the person is associated with.</w:t>
       </w:r>
     </w:p>
-    <w:bookmarkEnd w:id="84"/>
-    <w:bookmarkStart w:id="85" w:name="contactpoint"/>
+    <w:bookmarkEnd w:id="85"/>
+    <w:bookmarkStart w:id="86" w:name="contactpoint"/>
     <w:p>
       <w:pPr>
         <w:pStyle w:val="Heading4"/>
@@ -4631,8 +4730,8 @@
         <w:t xml:space="preserve">email is required property if a contactPoint is included. Schema.org allows telephone and postal contacts as well.</w:t>
       </w:r>
     </w:p>
-    <w:bookmarkEnd w:id="85"/>
-    <w:bookmarkStart w:id="86" w:name="sameas-1"/>
+    <w:bookmarkEnd w:id="86"/>
+    <w:bookmarkStart w:id="87" w:name="sameas-1"/>
     <w:p>
       <w:pPr>
         <w:pStyle w:val="Heading4"/>
@@ -4693,9 +4792,9 @@
         </w:r>
       </w:hyperlink>
     </w:p>
-    <w:bookmarkEnd w:id="86"/>
     <w:bookmarkEnd w:id="87"/>
-    <w:bookmarkStart w:id="96" w:name="sec-organization"/>
+    <w:bookmarkEnd w:id="88"/>
+    <w:bookmarkStart w:id="97" w:name="sec-organization"/>
     <w:p>
       <w:pPr>
         <w:pStyle w:val="Heading3"/>
@@ -4704,7 +4803,7 @@
         <w:t xml:space="preserve">Organization</w:t>
       </w:r>
     </w:p>
-    <w:bookmarkStart w:id="88" w:name="id-3"/>
+    <w:bookmarkStart w:id="89" w:name="id-3"/>
     <w:p>
       <w:pPr>
         <w:pStyle w:val="Heading4"/>
@@ -4772,8 +4871,8 @@
         <w:t xml:space="preserve">Identifier for this graph node. Useful to reference this Organization using object references if they appear more that once in the metadata record.</w:t>
       </w:r>
     </w:p>
-    <w:bookmarkEnd w:id="88"/>
-    <w:bookmarkStart w:id="89" w:name="type-4"/>
+    <w:bookmarkEnd w:id="89"/>
+    <w:bookmarkStart w:id="90" w:name="type-4"/>
     <w:p>
       <w:pPr>
         <w:pStyle w:val="Heading4"/>
@@ -4856,8 +4955,8 @@
         <w:t xml:space="preserve">rdf:type, list must include Organization, but other schema.org types can be added for more precision: FundingAgency, Consortium, Corporation, EducationalOrganization, FundingScheme, GovernmentOrganization, NGO, Project, ResearchOrganization, defined by enumeration in the schema.</w:t>
       </w:r>
     </w:p>
-    <w:bookmarkEnd w:id="89"/>
-    <w:bookmarkStart w:id="90" w:name="name-4"/>
+    <w:bookmarkEnd w:id="90"/>
+    <w:bookmarkStart w:id="91" w:name="name-4"/>
     <w:p>
       <w:pPr>
         <w:pStyle w:val="Heading4"/>
@@ -4925,8 +5024,8 @@
         <w:t xml:space="preserve">Label for the Organization</w:t>
       </w:r>
     </w:p>
-    <w:bookmarkEnd w:id="90"/>
-    <w:bookmarkStart w:id="91" w:name="identifier-2"/>
+    <w:bookmarkEnd w:id="91"/>
+    <w:bookmarkStart w:id="92" w:name="identifier-2"/>
     <w:p>
       <w:pPr>
         <w:pStyle w:val="Heading4"/>
@@ -4987,8 +5086,8 @@
         </w:r>
       </w:hyperlink>
     </w:p>
-    <w:bookmarkEnd w:id="91"/>
-    <w:bookmarkStart w:id="92" w:name="additionaltype-1"/>
+    <w:bookmarkEnd w:id="92"/>
+    <w:bookmarkStart w:id="93" w:name="additionaltype-1"/>
     <w:p>
       <w:pPr>
         <w:pStyle w:val="Heading4"/>
@@ -5049,8 +5148,8 @@
         </w:r>
       </w:hyperlink>
     </w:p>
-    <w:bookmarkEnd w:id="92"/>
-    <w:bookmarkStart w:id="93" w:name="alternatename-1"/>
+    <w:bookmarkEnd w:id="93"/>
+    <w:bookmarkStart w:id="94" w:name="alternatename-1"/>
     <w:p>
       <w:pPr>
         <w:pStyle w:val="Heading4"/>
@@ -5118,8 +5217,8 @@
         <w:t xml:space="preserve">other labels by which the organization might be known</w:t>
       </w:r>
     </w:p>
-    <w:bookmarkEnd w:id="93"/>
-    <w:bookmarkStart w:id="94" w:name="description-3"/>
+    <w:bookmarkEnd w:id="94"/>
+    <w:bookmarkStart w:id="95" w:name="description-3"/>
     <w:p>
       <w:pPr>
         <w:pStyle w:val="Heading4"/>
@@ -5169,8 +5268,8 @@
         <w:t xml:space="preserve">string</w:t>
       </w:r>
     </w:p>
-    <w:bookmarkEnd w:id="94"/>
-    <w:bookmarkStart w:id="95" w:name="sameas-2"/>
+    <w:bookmarkEnd w:id="95"/>
+    <w:bookmarkStart w:id="96" w:name="sameas-2"/>
     <w:p>
       <w:pPr>
         <w:pStyle w:val="Heading4"/>
@@ -5231,9 +5330,9 @@
         </w:r>
       </w:hyperlink>
     </w:p>
-    <w:bookmarkEnd w:id="95"/>
     <w:bookmarkEnd w:id="96"/>
-    <w:bookmarkStart w:id="99" w:name="sec-contactpoint"/>
+    <w:bookmarkEnd w:id="97"/>
+    <w:bookmarkStart w:id="100" w:name="sec-contactpoint"/>
     <w:p>
       <w:pPr>
         <w:pStyle w:val="Heading3"/>
@@ -5250,7 +5349,7 @@
         <w:t xml:space="preserve">Information about how to communicate with a person or organization. CDIF only includes e-mail in its schema.</w:t>
       </w:r>
     </w:p>
-    <w:bookmarkStart w:id="97" w:name="type-5"/>
+    <w:bookmarkStart w:id="98" w:name="type-5"/>
     <w:p>
       <w:pPr>
         <w:pStyle w:val="Heading4"/>
@@ -5315,8 +5414,8 @@
         <w:t xml:space="preserve">string.uri</w:t>
       </w:r>
     </w:p>
-    <w:bookmarkEnd w:id="97"/>
-    <w:bookmarkStart w:id="98" w:name="email"/>
+    <w:bookmarkEnd w:id="98"/>
+    <w:bookmarkStart w:id="99" w:name="email"/>
     <w:p>
       <w:pPr>
         <w:pStyle w:val="Heading4"/>
@@ -5384,9 +5483,9 @@
         <w:t xml:space="preserve">Property is required if a contactPoint property is included. Use missing@example.org if e-mail address is not available. Recommend using position-based contact point because people move around.</w:t>
       </w:r>
     </w:p>
-    <w:bookmarkEnd w:id="98"/>
     <w:bookmarkEnd w:id="99"/>
-    <w:bookmarkStart w:id="104" w:name="sec-contributor"/>
+    <w:bookmarkEnd w:id="100"/>
+    <w:bookmarkStart w:id="105" w:name="sec-contributor"/>
     <w:p>
       <w:pPr>
         <w:pStyle w:val="Heading3"/>
@@ -5405,7 +5504,7 @@
       <w:r>
         <w:t xml:space="preserve"> </w:t>
       </w:r>
-      <w:hyperlink r:id="rId100">
+      <w:hyperlink r:id="rId101">
         <w:r>
           <w:rPr>
             <w:rStyle w:val="Hyperlink"/>
@@ -5417,7 +5516,7 @@
         <w:t xml:space="preserve">.</w:t>
       </w:r>
     </w:p>
-    <w:bookmarkStart w:id="101" w:name="type-6"/>
+    <w:bookmarkStart w:id="102" w:name="type-6"/>
     <w:p>
       <w:pPr>
         <w:pStyle w:val="Heading4"/>
@@ -5500,8 +5599,8 @@
         <w:t xml:space="preserve">rdf:type</w:t>
       </w:r>
     </w:p>
-    <w:bookmarkEnd w:id="101"/>
-    <w:bookmarkStart w:id="102" w:name="rolename"/>
+    <w:bookmarkEnd w:id="102"/>
+    <w:bookmarkStart w:id="103" w:name="rolename"/>
     <w:p>
       <w:pPr>
         <w:pStyle w:val="Heading4"/>
@@ -5580,8 +5679,8 @@
         <w:t xml:space="preserve">term that specifies the relationship between the contributor and the described resource.</w:t>
       </w:r>
     </w:p>
-    <w:bookmarkEnd w:id="102"/>
-    <w:bookmarkStart w:id="103" w:name="contributor-1"/>
+    <w:bookmarkEnd w:id="103"/>
+    <w:bookmarkStart w:id="104" w:name="contributor-1"/>
     <w:p>
       <w:pPr>
         <w:pStyle w:val="Heading4"/>
@@ -5667,9 +5766,9 @@
         </w:r>
       </w:hyperlink>
     </w:p>
-    <w:bookmarkEnd w:id="103"/>
     <w:bookmarkEnd w:id="104"/>
-    <w:bookmarkStart w:id="110" w:name="sec-monetarygrant"/>
+    <w:bookmarkEnd w:id="105"/>
+    <w:bookmarkStart w:id="111" w:name="sec-monetarygrant"/>
     <w:p>
       <w:pPr>
         <w:pStyle w:val="Heading3"/>
@@ -5678,7 +5777,7 @@
         <w:t xml:space="preserve">MonetaryGrant</w:t>
       </w:r>
     </w:p>
-    <w:bookmarkStart w:id="105" w:name="type-7"/>
+    <w:bookmarkStart w:id="106" w:name="type-7"/>
     <w:p>
       <w:pPr>
         <w:pStyle w:val="Heading4"/>
@@ -5751,8 +5850,8 @@
         <w:t xml:space="preserve">CHOICE (at least one of identifier, name, or funder</w:t>
       </w:r>
     </w:p>
-    <w:bookmarkEnd w:id="105"/>
-    <w:bookmarkStart w:id="106" w:name="identifier-3"/>
+    <w:bookmarkEnd w:id="106"/>
+    <w:bookmarkStart w:id="107" w:name="identifier-3"/>
     <w:p>
       <w:pPr>
         <w:pStyle w:val="Heading4"/>
@@ -5831,8 +5930,8 @@
         <w:t xml:space="preserve">identifier for a particular grant</w:t>
       </w:r>
     </w:p>
-    <w:bookmarkEnd w:id="106"/>
-    <w:bookmarkStart w:id="107" w:name="name-5"/>
+    <w:bookmarkEnd w:id="107"/>
+    <w:bookmarkStart w:id="108" w:name="name-5"/>
     <w:p>
       <w:pPr>
         <w:pStyle w:val="Heading4"/>
@@ -5900,8 +5999,8 @@
         <w:t xml:space="preserve">title of the grant</w:t>
       </w:r>
     </w:p>
-    <w:bookmarkEnd w:id="107"/>
-    <w:bookmarkStart w:id="108" w:name="funder"/>
+    <w:bookmarkEnd w:id="108"/>
+    <w:bookmarkStart w:id="109" w:name="funder"/>
     <w:p>
       <w:pPr>
         <w:pStyle w:val="Heading4"/>
@@ -5984,8 +6083,8 @@
         </w:r>
       </w:hyperlink>
     </w:p>
-    <w:bookmarkEnd w:id="108"/>
-    <w:bookmarkStart w:id="109" w:name="description-4"/>
+    <w:bookmarkEnd w:id="109"/>
+    <w:bookmarkStart w:id="110" w:name="description-4"/>
     <w:p>
       <w:pPr>
         <w:pStyle w:val="Heading4"/>
@@ -6053,9 +6152,9 @@
         <w:t xml:space="preserve">description of the funding or grant</w:t>
       </w:r>
     </w:p>
-    <w:bookmarkEnd w:id="109"/>
     <w:bookmarkEnd w:id="110"/>
-    <w:bookmarkStart w:id="120" w:name="sec-catalogrecord"/>
+    <w:bookmarkEnd w:id="111"/>
+    <w:bookmarkStart w:id="121" w:name="sec-catalogrecord"/>
     <w:p>
       <w:pPr>
         <w:pStyle w:val="Heading3"/>
@@ -6072,7 +6171,7 @@
         <w:t xml:space="preserve">This is the class used to provide information about the metadata record itself.</w:t>
       </w:r>
     </w:p>
-    <w:bookmarkStart w:id="111" w:name="id-4"/>
+    <w:bookmarkStart w:id="112" w:name="id-4"/>
     <w:p>
       <w:pPr>
         <w:pStyle w:val="Heading4"/>
@@ -6140,8 +6239,8 @@
         <w:t xml:space="preserve">Identifier for the metadata record.</w:t>
       </w:r>
     </w:p>
-    <w:bookmarkEnd w:id="111"/>
-    <w:bookmarkStart w:id="112" w:name="type-8"/>
+    <w:bookmarkEnd w:id="112"/>
+    <w:bookmarkStart w:id="113" w:name="type-8"/>
     <w:p>
       <w:pPr>
         <w:pStyle w:val="Heading4"/>
@@ -6206,8 +6305,8 @@
         <w:t xml:space="preserve">string.uri</w:t>
       </w:r>
     </w:p>
-    <w:bookmarkEnd w:id="112"/>
-    <w:bookmarkStart w:id="113" w:name="additionaltype-2"/>
+    <w:bookmarkEnd w:id="113"/>
+    <w:bookmarkStart w:id="114" w:name="additionaltype-2"/>
     <w:p>
       <w:pPr>
         <w:pStyle w:val="Heading4"/>
@@ -6272,8 +6371,8 @@
         <w:t xml:space="preserve">string</w:t>
       </w:r>
     </w:p>
-    <w:bookmarkEnd w:id="113"/>
-    <w:bookmarkStart w:id="114" w:name="about"/>
+    <w:bookmarkEnd w:id="114"/>
+    <w:bookmarkStart w:id="115" w:name="about"/>
     <w:p>
       <w:pPr>
         <w:pStyle w:val="Heading4"/>
@@ -6358,8 +6457,8 @@
         <w:t xml:space="preserve">of that record.</w:t>
       </w:r>
     </w:p>
-    <w:bookmarkEnd w:id="114"/>
-    <w:bookmarkStart w:id="115" w:name="conformsto"/>
+    <w:bookmarkEnd w:id="115"/>
+    <w:bookmarkStart w:id="116" w:name="conformsto"/>
     <w:p>
       <w:pPr>
         <w:pStyle w:val="Heading4"/>
@@ -6447,8 +6546,8 @@
         <w:t xml:space="preserve">; a record that also conforms to a higher-level profile (e.g. Discovery) lists that profile’s identifier as well.</w:t>
       </w:r>
     </w:p>
-    <w:bookmarkEnd w:id="115"/>
-    <w:bookmarkStart w:id="116" w:name="description-5"/>
+    <w:bookmarkEnd w:id="116"/>
+    <w:bookmarkStart w:id="117" w:name="description-5"/>
     <w:p>
       <w:pPr>
         <w:pStyle w:val="Heading4"/>
@@ -6516,8 +6615,8 @@
         <w:t xml:space="preserve">other information about the metadata record that might be useful.</w:t>
       </w:r>
     </w:p>
-    <w:bookmarkEnd w:id="116"/>
-    <w:bookmarkStart w:id="117" w:name="maintainer"/>
+    <w:bookmarkEnd w:id="117"/>
+    <w:bookmarkStart w:id="118" w:name="maintainer"/>
     <w:p>
       <w:pPr>
         <w:pStyle w:val="Heading4"/>
@@ -6607,8 +6706,8 @@
         <w:t xml:space="preserve">Identification of the agent that maintains the metadata, with contact information. Should include person name and affiliation, or position name and affiliation, or just organization name. e-mail address is preferred contact information.</w:t>
       </w:r>
     </w:p>
-    <w:bookmarkEnd w:id="117"/>
-    <w:bookmarkStart w:id="118" w:name="sddatepublished"/>
+    <w:bookmarkEnd w:id="118"/>
+    <w:bookmarkStart w:id="119" w:name="sddatepublished"/>
     <w:p>
       <w:pPr>
         <w:pStyle w:val="Heading4"/>
@@ -6676,8 +6775,8 @@
         <w:t xml:space="preserve">date of most recent update to the metadata content</w:t>
       </w:r>
     </w:p>
-    <w:bookmarkEnd w:id="118"/>
-    <w:bookmarkStart w:id="119" w:name="includedindatacatalog"/>
+    <w:bookmarkEnd w:id="119"/>
+    <w:bookmarkStart w:id="120" w:name="includedindatacatalog"/>
     <w:p>
       <w:pPr>
         <w:pStyle w:val="Heading4"/>
@@ -6750,9 +6849,9 @@
         <w:t xml:space="preserve">identify the source for the origin the metadata record</w:t>
       </w:r>
     </w:p>
-    <w:bookmarkEnd w:id="119"/>
     <w:bookmarkEnd w:id="120"/>
-    <w:bookmarkStart w:id="126" w:name="sec-datacatalog"/>
+    <w:bookmarkEnd w:id="121"/>
+    <w:bookmarkStart w:id="127" w:name="sec-datacatalog"/>
     <w:p>
       <w:pPr>
         <w:pStyle w:val="Heading3"/>
@@ -6769,7 +6868,7 @@
         <w:t xml:space="preserve">An accessible collection of data. The data might be metadata (about other resources) or datasets.</w:t>
       </w:r>
     </w:p>
-    <w:bookmarkStart w:id="121" w:name="type-9"/>
+    <w:bookmarkStart w:id="122" w:name="type-9"/>
     <w:p>
       <w:pPr>
         <w:pStyle w:val="Heading4"/>
@@ -6834,8 +6933,8 @@
         <w:t xml:space="preserve">string.uri</w:t>
       </w:r>
     </w:p>
-    <w:bookmarkEnd w:id="121"/>
-    <w:bookmarkStart w:id="122" w:name="id-5"/>
+    <w:bookmarkEnd w:id="122"/>
+    <w:bookmarkStart w:id="123" w:name="id-5"/>
     <w:p>
       <w:pPr>
         <w:pStyle w:val="Heading4"/>
@@ -6903,8 +7002,8 @@
         <w:t xml:space="preserve">identifier for graph node.</w:t>
       </w:r>
     </w:p>
-    <w:bookmarkEnd w:id="122"/>
-    <w:bookmarkStart w:id="123" w:name="name-6"/>
+    <w:bookmarkEnd w:id="123"/>
+    <w:bookmarkStart w:id="124" w:name="name-6"/>
     <w:p>
       <w:pPr>
         <w:pStyle w:val="Heading4"/>
@@ -6972,8 +7071,8 @@
         <w:t xml:space="preserve">Label for the data catalog.</w:t>
       </w:r>
     </w:p>
-    <w:bookmarkEnd w:id="123"/>
-    <w:bookmarkStart w:id="124" w:name="url-1"/>
+    <w:bookmarkEnd w:id="124"/>
+    <w:bookmarkStart w:id="125" w:name="url-1"/>
     <w:p>
       <w:pPr>
         <w:pStyle w:val="Heading4"/>
@@ -7041,8 +7140,8 @@
         <w:t xml:space="preserve">Url to access catalog landing page.</w:t>
       </w:r>
     </w:p>
-    <w:bookmarkEnd w:id="124"/>
-    <w:bookmarkStart w:id="125" w:name="identifier-4"/>
+    <w:bookmarkEnd w:id="125"/>
+    <w:bookmarkStart w:id="126" w:name="identifier-4"/>
     <w:p>
       <w:pPr>
         <w:pStyle w:val="Heading4"/>
@@ -7121,9 +7220,9 @@
         <w:t xml:space="preserve">Identifier for the data catalog.</w:t>
       </w:r>
     </w:p>
-    <w:bookmarkEnd w:id="125"/>
     <w:bookmarkEnd w:id="126"/>
-    <w:bookmarkStart w:id="132" w:name="sec-definedterm"/>
+    <w:bookmarkEnd w:id="127"/>
+    <w:bookmarkStart w:id="133" w:name="sec-definedterm"/>
     <w:p>
       <w:pPr>
         <w:pStyle w:val="Heading3"/>
@@ -7132,7 +7231,7 @@
         <w:t xml:space="preserve">Defined Term</w:t>
       </w:r>
     </w:p>
-    <w:bookmarkStart w:id="127" w:name="type-10"/>
+    <w:bookmarkStart w:id="128" w:name="type-10"/>
     <w:p>
       <w:pPr>
         <w:pStyle w:val="Heading4"/>
@@ -7197,8 +7296,8 @@
         <w:t xml:space="preserve">string.uri</w:t>
       </w:r>
     </w:p>
-    <w:bookmarkEnd w:id="127"/>
-    <w:bookmarkStart w:id="128" w:name="name-7"/>
+    <w:bookmarkEnd w:id="128"/>
+    <w:bookmarkStart w:id="129" w:name="name-7"/>
     <w:p>
       <w:pPr>
         <w:pStyle w:val="Heading4"/>
@@ -7266,8 +7365,8 @@
         <w:t xml:space="preserve">label for the term</w:t>
       </w:r>
     </w:p>
-    <w:bookmarkEnd w:id="128"/>
-    <w:bookmarkStart w:id="129" w:name="identifier-5"/>
+    <w:bookmarkEnd w:id="129"/>
+    <w:bookmarkStart w:id="130" w:name="identifier-5"/>
     <w:p>
       <w:pPr>
         <w:pStyle w:val="Heading4"/>
@@ -7328,8 +7427,8 @@
         </w:r>
       </w:hyperlink>
     </w:p>
-    <w:bookmarkEnd w:id="129"/>
-    <w:bookmarkStart w:id="130" w:name="termcode"/>
+    <w:bookmarkEnd w:id="130"/>
+    <w:bookmarkStart w:id="131" w:name="termcode"/>
     <w:p>
       <w:pPr>
         <w:pStyle w:val="Heading4"/>
@@ -7397,8 +7496,8 @@
         <w:t xml:space="preserve">A representative code for this keyword in the controlled vocabulary. Analogous to skos:Notation</w:t>
       </w:r>
     </w:p>
-    <w:bookmarkEnd w:id="130"/>
-    <w:bookmarkStart w:id="131" w:name="indefinedtermset"/>
+    <w:bookmarkEnd w:id="131"/>
+    <w:bookmarkStart w:id="132" w:name="indefinedtermset"/>
     <w:p>
       <w:pPr>
         <w:pStyle w:val="Heading4"/>
@@ -7466,10 +7565,10 @@
         <w:t xml:space="preserve">Name for the controlled vocabulary responsible for this keyword.</w:t>
       </w:r>
     </w:p>
-    <w:bookmarkEnd w:id="131"/>
     <w:bookmarkEnd w:id="132"/>
     <w:bookmarkEnd w:id="133"/>
-    <w:bookmarkStart w:id="162" w:name="data-types-used-for-cdif-core"/>
+    <w:bookmarkEnd w:id="134"/>
+    <w:bookmarkStart w:id="163" w:name="data-types-used-for-cdif-core"/>
     <w:p>
       <w:pPr>
         <w:pStyle w:val="Heading2"/>
@@ -7478,7 +7577,7 @@
         <w:t xml:space="preserve">Data types used for CDIF Core</w:t>
       </w:r>
     </w:p>
-    <w:bookmarkStart w:id="138" w:name="sec-propertyvalue"/>
+    <w:bookmarkStart w:id="139" w:name="sec-propertyvalue"/>
     <w:p>
       <w:pPr>
         <w:pStyle w:val="Heading3"/>
@@ -7487,7 +7586,7 @@
         <w:t xml:space="preserve">PropertyValue-(identifier)</w:t>
       </w:r>
     </w:p>
-    <w:bookmarkStart w:id="134" w:name="type-11"/>
+    <w:bookmarkStart w:id="135" w:name="type-11"/>
     <w:p>
       <w:pPr>
         <w:pStyle w:val="Heading4"/>
@@ -7552,8 +7651,8 @@
         <w:t xml:space="preserve">string.uri</w:t>
       </w:r>
     </w:p>
-    <w:bookmarkEnd w:id="134"/>
-    <w:bookmarkStart w:id="135" w:name="value"/>
+    <w:bookmarkEnd w:id="135"/>
+    <w:bookmarkStart w:id="136" w:name="value"/>
     <w:p>
       <w:pPr>
         <w:pStyle w:val="Heading4"/>
@@ -7621,8 +7720,8 @@
         <w:t xml:space="preserve">the identifier string. E.g. 10.5066/F7VX0DMQ</w:t>
       </w:r>
     </w:p>
-    <w:bookmarkEnd w:id="135"/>
-    <w:bookmarkStart w:id="136" w:name="url-2"/>
+    <w:bookmarkEnd w:id="136"/>
+    <w:bookmarkStart w:id="137" w:name="url-2"/>
     <w:p>
       <w:pPr>
         <w:pStyle w:val="Heading4"/>
@@ -7690,8 +7789,8 @@
         <w:t xml:space="preserve">web-resolveable string for the identifier; host name part is location of a resolver that will return some representation for the given identifier value. E.g. https://doi.org/10.5066/F7VX0DMQ</w:t>
       </w:r>
     </w:p>
-    <w:bookmarkEnd w:id="136"/>
-    <w:bookmarkStart w:id="137" w:name="propertyid"/>
+    <w:bookmarkEnd w:id="137"/>
+    <w:bookmarkStart w:id="138" w:name="propertyid"/>
     <w:p>
       <w:pPr>
         <w:pStyle w:val="Heading4"/>
@@ -7759,9 +7858,9 @@
         <w:t xml:space="preserve">In this context for the schema:PropertyValue, this field is an identifier for the identifier schema, e.g. DOI, ARK. Get values from https://registry.identifiers.org/registry/ for interoperability</w:t>
       </w:r>
     </w:p>
-    <w:bookmarkEnd w:id="137"/>
     <w:bookmarkEnd w:id="138"/>
-    <w:bookmarkStart w:id="143" w:name="sec-labeledlink"/>
+    <w:bookmarkEnd w:id="139"/>
+    <w:bookmarkStart w:id="144" w:name="sec-labeledlink"/>
     <w:p>
       <w:pPr>
         <w:pStyle w:val="Heading3"/>
@@ -7770,7 +7869,7 @@
         <w:t xml:space="preserve">Labeled Link</w:t>
       </w:r>
     </w:p>
-    <w:bookmarkStart w:id="139" w:name="type-12"/>
+    <w:bookmarkStart w:id="140" w:name="type-12"/>
     <w:p>
       <w:pPr>
         <w:pStyle w:val="Heading4"/>
@@ -7835,8 +7934,8 @@
         <w:t xml:space="preserve">string.uri</w:t>
       </w:r>
     </w:p>
-    <w:bookmarkEnd w:id="139"/>
-    <w:bookmarkStart w:id="140" w:name="url-3"/>
+    <w:bookmarkEnd w:id="140"/>
+    <w:bookmarkStart w:id="141" w:name="url-3"/>
     <w:p>
       <w:pPr>
         <w:pStyle w:val="Heading4"/>
@@ -7904,8 +8003,8 @@
         <w:t xml:space="preserve">URL for web location to GET the resource</w:t>
       </w:r>
     </w:p>
-    <w:bookmarkEnd w:id="140"/>
-    <w:bookmarkStart w:id="141" w:name="name-8"/>
+    <w:bookmarkEnd w:id="141"/>
+    <w:bookmarkStart w:id="142" w:name="name-8"/>
     <w:p>
       <w:pPr>
         <w:pStyle w:val="Heading4"/>
@@ -7973,8 +8072,8 @@
         <w:t xml:space="preserve">Label for the linked resource</w:t>
       </w:r>
     </w:p>
-    <w:bookmarkEnd w:id="141"/>
-    <w:bookmarkStart w:id="142" w:name="description-6"/>
+    <w:bookmarkEnd w:id="142"/>
+    <w:bookmarkStart w:id="143" w:name="description-6"/>
     <w:p>
       <w:pPr>
         <w:pStyle w:val="Heading4"/>
@@ -8042,9 +8141,9 @@
         <w:t xml:space="preserve">Text description of the linked resource.</w:t>
       </w:r>
     </w:p>
-    <w:bookmarkEnd w:id="142"/>
     <w:bookmarkEnd w:id="143"/>
-    <w:bookmarkStart w:id="146" w:name="sec-spdxchecksum"/>
+    <w:bookmarkEnd w:id="144"/>
+    <w:bookmarkStart w:id="147" w:name="sec-spdxchecksum"/>
     <w:p>
       <w:pPr>
         <w:pStyle w:val="Heading3"/>
@@ -8053,7 +8152,7 @@
         <w:t xml:space="preserve">spdx:Checksum</w:t>
       </w:r>
     </w:p>
-    <w:bookmarkStart w:id="144" w:name="spdxalgorithm"/>
+    <w:bookmarkStart w:id="145" w:name="spdxalgorithm"/>
     <w:p>
       <w:pPr>
         <w:pStyle w:val="Heading4"/>
@@ -8121,8 +8220,8 @@
         <w:t xml:space="preserve">Name or identifier for the algorithm used to calculate the checksum.</w:t>
       </w:r>
     </w:p>
-    <w:bookmarkEnd w:id="144"/>
-    <w:bookmarkStart w:id="145" w:name="spdx-checksumvalue"/>
+    <w:bookmarkEnd w:id="145"/>
+    <w:bookmarkStart w:id="146" w:name="spdx-checksumvalue"/>
     <w:p>
       <w:pPr>
         <w:pStyle w:val="Heading4"/>
@@ -8190,9 +8289,9 @@
         <w:t xml:space="preserve">the checksum string.</w:t>
       </w:r>
     </w:p>
-    <w:bookmarkEnd w:id="145"/>
     <w:bookmarkEnd w:id="146"/>
-    <w:bookmarkStart w:id="150" w:name="sec-linkrole"/>
+    <w:bookmarkEnd w:id="147"/>
+    <w:bookmarkStart w:id="151" w:name="sec-linkrole"/>
     <w:p>
       <w:pPr>
         <w:pStyle w:val="Heading3"/>
@@ -8209,7 +8308,7 @@
         <w:t xml:space="preserve">This is the type used for links that have an associated semantic conveyed by the linkRelationship.</w:t>
       </w:r>
     </w:p>
-    <w:bookmarkStart w:id="147" w:name="type-13"/>
+    <w:bookmarkStart w:id="148" w:name="type-13"/>
     <w:p>
       <w:pPr>
         <w:pStyle w:val="Heading4"/>
@@ -8274,8 +8373,8 @@
         <w:t xml:space="preserve">string.uri</w:t>
       </w:r>
     </w:p>
-    <w:bookmarkEnd w:id="147"/>
-    <w:bookmarkStart w:id="148" w:name="linkrelationship"/>
+    <w:bookmarkEnd w:id="148"/>
+    <w:bookmarkStart w:id="149" w:name="linkrelationship"/>
     <w:p>
       <w:pPr>
         <w:pStyle w:val="Heading4"/>
@@ -8354,8 +8453,8 @@
         <w:t xml:space="preserve">Term that specifies the relationship between the source and target of the link.</w:t>
       </w:r>
     </w:p>
-    <w:bookmarkEnd w:id="148"/>
-    <w:bookmarkStart w:id="149" w:name="target-1"/>
+    <w:bookmarkEnd w:id="149"/>
+    <w:bookmarkStart w:id="150" w:name="target-1"/>
     <w:p>
       <w:pPr>
         <w:pStyle w:val="Heading4"/>
@@ -8428,9 +8527,9 @@
         <w:t xml:space="preserve">URL for link target, along with a label and encoding format for the target resource.</w:t>
       </w:r>
     </w:p>
-    <w:bookmarkEnd w:id="149"/>
     <w:bookmarkEnd w:id="150"/>
-    <w:bookmarkStart w:id="155" w:name="sec-entrypoint"/>
+    <w:bookmarkEnd w:id="151"/>
+    <w:bookmarkStart w:id="156" w:name="sec-entrypoint"/>
     <w:p>
       <w:pPr>
         <w:pStyle w:val="Heading3"/>
@@ -8447,7 +8546,7 @@
         <w:t xml:space="preserve">Use to document the URL that is the target for invoking an action, or that is the target object of a link relationship.</w:t>
       </w:r>
     </w:p>
-    <w:bookmarkStart w:id="151" w:name="type-14"/>
+    <w:bookmarkStart w:id="152" w:name="type-14"/>
     <w:p>
       <w:pPr>
         <w:pStyle w:val="Heading4"/>
@@ -8512,8 +8611,8 @@
         <w:t xml:space="preserve">string. Uri</w:t>
       </w:r>
     </w:p>
-    <w:bookmarkEnd w:id="151"/>
-    <w:bookmarkStart w:id="152" w:name="encodingformat-1"/>
+    <w:bookmarkEnd w:id="152"/>
+    <w:bookmarkStart w:id="153" w:name="encodingformat-1"/>
     <w:p>
       <w:pPr>
         <w:pStyle w:val="Heading4"/>
@@ -8581,8 +8680,8 @@
         <w:t xml:space="preserve">MIME type / media type identifier for the representation returned from the URL.</w:t>
       </w:r>
     </w:p>
-    <w:bookmarkEnd w:id="152"/>
-    <w:bookmarkStart w:id="153" w:name="name-9"/>
+    <w:bookmarkEnd w:id="153"/>
+    <w:bookmarkStart w:id="154" w:name="name-9"/>
     <w:p>
       <w:pPr>
         <w:pStyle w:val="Heading4"/>
@@ -8650,8 +8749,8 @@
         <w:t xml:space="preserve">Label for the resource located by the URL</w:t>
       </w:r>
     </w:p>
-    <w:bookmarkEnd w:id="153"/>
-    <w:bookmarkStart w:id="154" w:name="url-4"/>
+    <w:bookmarkEnd w:id="154"/>
+    <w:bookmarkStart w:id="155" w:name="url-4"/>
     <w:p>
       <w:pPr>
         <w:pStyle w:val="Heading4"/>
@@ -8719,9 +8818,9 @@
         <w:t xml:space="preserve">Locator that can be used to retrieve the target resource on the Web.</w:t>
       </w:r>
     </w:p>
-    <w:bookmarkEnd w:id="154"/>
     <w:bookmarkEnd w:id="155"/>
-    <w:bookmarkStart w:id="161" w:name="sec-propertyvaluespec"/>
+    <w:bookmarkEnd w:id="156"/>
+    <w:bookmarkStart w:id="162" w:name="sec-propertyvaluespec"/>
     <w:p>
       <w:pPr>
         <w:pStyle w:val="Heading3"/>
@@ -8738,7 +8837,7 @@
         <w:t xml:space="preserve">Description of the kind of value expected for a parameter value.</w:t>
       </w:r>
     </w:p>
-    <w:bookmarkStart w:id="156" w:name="type-15"/>
+    <w:bookmarkStart w:id="157" w:name="type-15"/>
     <w:p>
       <w:pPr>
         <w:pStyle w:val="Heading4"/>
@@ -8785,8 +8884,8 @@
         <w:t xml:space="preserve">, repeatable</w:t>
       </w:r>
     </w:p>
-    <w:bookmarkEnd w:id="156"/>
-    <w:bookmarkStart w:id="157" w:name="valuename"/>
+    <w:bookmarkEnd w:id="157"/>
+    <w:bookmarkStart w:id="158" w:name="valuename"/>
     <w:p>
       <w:pPr>
         <w:pStyle w:val="Heading4"/>
@@ -8854,8 +8953,8 @@
         <w:t xml:space="preserve">This will be used to match the specification to parameters in a template string used to construct a query.</w:t>
       </w:r>
     </w:p>
-    <w:bookmarkEnd w:id="157"/>
-    <w:bookmarkStart w:id="158" w:name="description-7"/>
+    <w:bookmarkEnd w:id="158"/>
+    <w:bookmarkStart w:id="159" w:name="description-7"/>
     <w:p>
       <w:pPr>
         <w:pStyle w:val="Heading4"/>
@@ -8923,8 +9022,8 @@
         <w:t xml:space="preserve">Explanation of the purpose of the parameter, its range of values, datatype, etc.</w:t>
       </w:r>
     </w:p>
-    <w:bookmarkEnd w:id="158"/>
-    <w:bookmarkStart w:id="159" w:name="valuerequired"/>
+    <w:bookmarkEnd w:id="159"/>
+    <w:bookmarkStart w:id="160" w:name="valuerequired"/>
     <w:p>
       <w:pPr>
         <w:pStyle w:val="Heading4"/>
@@ -8992,8 +9091,8 @@
         <w:t xml:space="preserve">Default is true. False if the specified parameter is not required to fill the template.</w:t>
       </w:r>
     </w:p>
-    <w:bookmarkEnd w:id="159"/>
-    <w:bookmarkStart w:id="160" w:name="valuepattern"/>
+    <w:bookmarkEnd w:id="160"/>
+    <w:bookmarkStart w:id="161" w:name="valuepattern"/>
     <w:p>
       <w:pPr>
         <w:pStyle w:val="Heading4"/>
@@ -9061,11 +9160,11 @@
         <w:t xml:space="preserve">regular expression to validate values for template parameters.</w:t>
       </w:r>
     </w:p>
-    <w:bookmarkEnd w:id="160"/>
     <w:bookmarkEnd w:id="161"/>
     <w:bookmarkEnd w:id="162"/>
     <w:bookmarkEnd w:id="163"/>
-    <w:bookmarkStart w:id="164" w:name="namespaces"/>
+    <w:bookmarkEnd w:id="164"/>
+    <w:bookmarkStart w:id="165" w:name="namespaces"/>
     <w:p>
       <w:pPr>
         <w:pStyle w:val="Heading1"/>
@@ -9411,8 +9510,8 @@
         <w:t xml:space="preserve">}</w:t>
       </w:r>
     </w:p>
-    <w:bookmarkEnd w:id="164"/>
-    <w:bookmarkStart w:id="177" w:name="notes-on-schema.org-implementation"/>
+    <w:bookmarkEnd w:id="165"/>
+    <w:bookmarkStart w:id="178" w:name="notes-on-schema.org-implementation"/>
     <w:p>
       <w:pPr>
         <w:pStyle w:val="Heading1"/>
@@ -9421,7 +9520,7 @@
         <w:t xml:space="preserve">Notes on schema.org implementation</w:t>
       </w:r>
     </w:p>
-    <w:bookmarkStart w:id="165" w:name="json-ld-type"/>
+    <w:bookmarkStart w:id="166" w:name="json-ld-type"/>
     <w:p>
       <w:pPr>
         <w:pStyle w:val="Heading2"/>
@@ -9480,8 +9579,8 @@
         <w:t xml:space="preserve">is always serialized as an array [JSON list] to allow for extensions that add additional typing.</w:t>
       </w:r>
     </w:p>
-    <w:bookmarkEnd w:id="165"/>
-    <w:bookmarkStart w:id="167" w:name="object-reference"/>
+    <w:bookmarkEnd w:id="166"/>
+    <w:bookmarkStart w:id="168" w:name="object-reference"/>
     <w:p>
       <w:pPr>
         <w:pStyle w:val="Heading2"/>
@@ -9562,7 +9661,7 @@
         </w:rPr>
         <w:t xml:space="preserve">“</w:t>
       </w:r>
-      <w:hyperlink r:id="rId166">
+      <w:hyperlink r:id="rId167">
         <w:r>
           <w:rPr>
             <w:rStyle w:val="Hyperlink"/>
@@ -9724,8 +9823,8 @@
         <w:t xml:space="preserve">is included as a value type for a property, be aware that instance documents might simply have this kind of object as the property value.</w:t>
       </w:r>
     </w:p>
-    <w:bookmarkEnd w:id="167"/>
-    <w:bookmarkStart w:id="168" w:name="repeating-values"/>
+    <w:bookmarkEnd w:id="168"/>
+    <w:bookmarkStart w:id="169" w:name="repeating-values"/>
     <w:p>
       <w:pPr>
         <w:pStyle w:val="Heading2"/>
@@ -9757,8 +9856,8 @@
         <w:t xml:space="preserve">, then assume the implementation is an array (JSON list).</w:t>
       </w:r>
     </w:p>
-    <w:bookmarkEnd w:id="168"/>
-    <w:bookmarkStart w:id="171" w:name="namespace-prefixes-and-json-validation."/>
+    <w:bookmarkEnd w:id="169"/>
+    <w:bookmarkStart w:id="172" w:name="namespace-prefixes-and-json-validation."/>
     <w:p>
       <w:pPr>
         <w:pStyle w:val="Heading2"/>
@@ -9843,7 +9942,7 @@
       <w:r>
         <w:t xml:space="preserve"> </w:t>
       </w:r>
-      <w:hyperlink r:id="rId169">
+      <w:hyperlink r:id="rId170">
         <w:r>
           <w:rPr>
             <w:rStyle w:val="Hyperlink"/>
@@ -9860,7 +9959,7 @@
       <w:r>
         <w:t xml:space="preserve"> </w:t>
       </w:r>
-      <w:hyperlink r:id="rId170">
+      <w:hyperlink r:id="rId171">
         <w:r>
           <w:rPr>
             <w:rStyle w:val="Hyperlink"/>
@@ -10016,8 +10115,8 @@
         <w:t xml:space="preserve">to frame and JSON-Schema-validate in one step.</w:t>
       </w:r>
     </w:p>
-    <w:bookmarkEnd w:id="171"/>
-    <w:bookmarkStart w:id="175" w:name="use-of-dcatcatalogrecord"/>
+    <w:bookmarkEnd w:id="172"/>
+    <w:bookmarkStart w:id="176" w:name="use-of-dcatcatalogrecord"/>
     <w:p>
       <w:pPr>
         <w:pStyle w:val="Heading2"/>
@@ -10041,7 +10140,7 @@
       <w:r>
         <w:t xml:space="preserve">In the RDF serialization, </w:t>
       </w:r>
-      <w:hyperlink r:id="rId172">
+      <w:hyperlink r:id="rId173">
         <w:r>
           <w:rPr>
             <w:rStyle w:val="Hyperlink"/>
@@ -10052,7 +10151,7 @@
       <w:r>
         <w:t xml:space="preserve"> metadata records are </w:t>
       </w:r>
-      <w:hyperlink r:id="rId173">
+      <w:hyperlink r:id="rId174">
         <w:r>
           <w:rPr>
             <w:rStyle w:val="Hyperlink"/>
@@ -10104,7 +10203,7 @@
       <w:r>
         <w:t xml:space="preserve">To avoid this ambiguity, CDIF adopts the convention that the </w:t>
       </w:r>
-      <w:hyperlink r:id="rId172">
+      <w:hyperlink r:id="rId173">
         <w:r>
           <w:rPr>
             <w:rStyle w:val="Hyperlink"/>
@@ -10224,7 +10323,7 @@
       <w:r>
         <w:t xml:space="preserve"> </w:t>
       </w:r>
-      <w:hyperlink r:id="rId174">
+      <w:hyperlink r:id="rId175">
         <w:r>
           <w:rPr>
             <w:rStyle w:val="Hyperlink"/>
@@ -11062,8 +11161,8 @@
         <w:t xml:space="preserve">Example: Instance with dcat CatalogRecord content (mapped to schema.org properties)</w:t>
       </w:r>
     </w:p>
-    <w:bookmarkEnd w:id="175"/>
-    <w:bookmarkStart w:id="176" w:name="polymorphism-of-propertyvalue"/>
+    <w:bookmarkEnd w:id="176"/>
+    <w:bookmarkStart w:id="177" w:name="polymorphism-of-propertyvalue"/>
     <w:p>
       <w:pPr>
         <w:pStyle w:val="Heading2"/>
@@ -11894,8 +11993,8 @@
         <w:t xml:space="preserve">-</w:t>
       </w:r>
     </w:p>
-    <w:bookmarkEnd w:id="176"/>
     <w:bookmarkEnd w:id="177"/>
+    <w:bookmarkEnd w:id="178"/>
     <w:sectPr>
       <w:pgSz w:h="15840" w:w="12240"/>
       <w:pgMar w:bottom="1440" w:footer="720" w:gutter="0" w:header="720" w:left="1440" w:right="1440" w:top="1440"/>

</xml_diff>